<commit_message>
Add arXiv preprint package and fix affiliation layout
- arXiv PDF (no line numbers), shortened abstract, submission guide
- Split the merged affiliation 5/6 paragraph in the manuscript
</commit_message>
<xml_diff>
--- a/Predicting_additional_screening_findings_manuscript.docx
+++ b/Predicting_additional_screening_findings_manuscript.docx
@@ -461,7 +461,7 @@
       <w:pPr>
         <w:spacing w:after="0" w:line="336" w:lineRule="auto"/>
         <w:ind w:left="480"/>
-        <w:jc w:val="both"/>
+        <w:jc w:val="left"/>
       </w:pPr>
       <w:r>
         <w:rPr>
@@ -471,9 +471,15 @@
           <w:sz w:val="24"/>
           <w:szCs w:val="24"/>
         </w:rPr>
-        <w:t>⁵ School of Computing Science, Simon Fraser University, Burnaby, BC, Canada -</w:t>
-      </w:r>
+        <w:t>⁵ School of Computing Science, Simon Fraser University, Burnaby, BC, Canada</w:t>
+      </w:r>
+    </w:p>
+    <w:p>
+      <w:pPr>
+        <w:spacing w:after="0" w:line="336" w:lineRule="auto"/>
+        <w:ind w:left="480"/>
+        <w:jc w:val="left"/>
+      </w:pPr>
       <w:r>
         <w:rPr>
           <w:rFonts w:ascii="Corben" w:eastAsia="Corben" w:hAnsi="Corben" w:cs="Corben"/>
@@ -483,7 +489,7 @@
           <w:szCs w:val="24"/>
         </w:rPr>
         <w:br/>
-        <w:t>⁶ Islamic Azad University, South Tehran Branch, Tehran, Iran </w:t>
+        <w:t>⁶ Islamic Azad University, South Tehran Branch, Tehran, Iran</w:t>
       </w:r>
       <w:r>
         <w:rPr>

</xml_diff>